<commit_message>
Added Infos so far
</commit_message>
<xml_diff>
--- a/DTU_SOC_FPGA/STUDENTS_CustomIP.docx
+++ b/DTU_SOC_FPGA/STUDENTS_CustomIP.docx
@@ -23,21 +23,7 @@
         <w:rPr>
           <w:highlight w:val="lightGray"/>
         </w:rPr>
-        <w:t xml:space="preserve"> </w:t>
-      </w:r>
-      <w:proofErr w:type="spellStart"/>
-      <w:r>
-        <w:rPr>
-          <w:highlight w:val="lightGray"/>
-        </w:rPr>
-        <w:t>Matlab</w:t>
-      </w:r>
-      <w:proofErr w:type="spellEnd"/>
-      <w:r>
-        <w:rPr>
-          <w:highlight w:val="lightGray"/>
-        </w:rPr>
-        <w:t xml:space="preserve"> </w:t>
+        <w:t xml:space="preserve"> Matlab </w:t>
       </w:r>
       <w:r>
         <w:rPr>
@@ -61,21 +47,7 @@
         <w:rPr>
           <w:highlight w:val="lightGray"/>
         </w:rPr>
-        <w:t xml:space="preserve"> </w:t>
-      </w:r>
-      <w:proofErr w:type="spellStart"/>
-      <w:r>
-        <w:rPr>
-          <w:highlight w:val="lightGray"/>
-        </w:rPr>
-        <w:t>Xlinx</w:t>
-      </w:r>
-      <w:proofErr w:type="spellEnd"/>
-      <w:r>
-        <w:rPr>
-          <w:highlight w:val="lightGray"/>
-        </w:rPr>
-        <w:t xml:space="preserve"> (synthesis)</w:t>
+        <w:t xml:space="preserve"> Xlinx (synthesis)</w:t>
       </w:r>
       <w:r>
         <w:t xml:space="preserve"> (warning} </w:t>
@@ -214,12 +186,33 @@
       </w:r>
       <w:r>
         <w:rPr>
+          <w:strike/>
           <w:highlight w:val="lightGray"/>
         </w:rPr>
         <w:t>NAMAN</w:t>
       </w:r>
       <w:r>
+        <w:rPr>
+          <w:strike/>
+        </w:rPr>
         <w:t xml:space="preserve"> </w:t>
+      </w:r>
+      <w:r>
+        <w:rPr>
+          <w:strike/>
+        </w:rPr>
+        <w:t xml:space="preserve"> </w:t>
+      </w:r>
+    </w:p>
+    <w:p>
+      <w:pPr>
+        <w:pStyle w:val="ListParagraph"/>
+      </w:pPr>
+      <w:r>
+        <w:t xml:space="preserve">{Sorry whats the </w:t>
+      </w:r>
+      <w:r>
+        <w:t>name}</w:t>
       </w:r>
     </w:p>
     <w:p>
@@ -303,15 +296,7 @@
         </w:numPr>
       </w:pPr>
       <w:r>
-        <w:t>FPGA – RISCV/ARM/Booting/</w:t>
-      </w:r>
-      <w:proofErr w:type="spellStart"/>
-      <w:r>
-        <w:t>Petalinux</w:t>
-      </w:r>
-      <w:proofErr w:type="spellEnd"/>
-      <w:r>
-        <w:t xml:space="preserve"> </w:t>
+        <w:t xml:space="preserve">FPGA – RISCV/ARM/Booting/Petalinux </w:t>
       </w:r>
       <w:r>
         <w:t xml:space="preserve"> </w:t>
@@ -339,6 +324,315 @@
       </w:r>
       <w:r>
         <w:t xml:space="preserve"> </w:t>
+      </w:r>
+    </w:p>
+    <w:p>
+      <w:r>
+        <w:t xml:space="preserve">1.   </w:t>
+      </w:r>
+      <w:r>
+        <w:t>Yash:</w:t>
+      </w:r>
+      <w:r>
+        <w:t xml:space="preserve"> </w:t>
+      </w:r>
+      <w:r>
+        <w:t xml:space="preserve"> https://github.com/ridoluc/rvcpu-rv32im-soc (a) He needs to read this github codes (b) try to git clone and run the simulation in his local laptop/PC  (c) try synthesis the design in vivado (see if its getting synthesize) (d) try boot in Virtex fpga (if synthesis working)</w:t>
+      </w:r>
+    </w:p>
+    <w:p>
+      <w:r>
+        <w:sym w:font="Wingdings" w:char="F0E0"/>
+      </w:r>
+      <w:r>
+        <w:t xml:space="preserve"> this won’t work in ML</w:t>
+      </w:r>
+      <w:r>
+        <w:t>4</w:t>
+      </w:r>
+      <w:r>
+        <w:t>0X</w:t>
+      </w:r>
+      <w:r>
+        <w:t>,</w:t>
+      </w:r>
+      <w:r>
+        <w:t xml:space="preserve"> taking </w:t>
+      </w:r>
+      <w:r>
+        <w:t>chances!</w:t>
+      </w:r>
+      <w:r>
+        <w:t xml:space="preserve"> </w:t>
+      </w:r>
+      <w:r>
+        <w:rPr>
+          <mc:AlternateContent>
+            <mc:Choice Requires="w16se"/>
+            <mc:Fallback>
+              <w:rFonts w:ascii="Segoe UI Emoji" w:eastAsia="Segoe UI Emoji" w:hAnsi="Segoe UI Emoji" w:cs="Segoe UI Emoji"/>
+            </mc:Fallback>
+          </mc:AlternateContent>
+        </w:rPr>
+        <mc:AlternateContent>
+          <mc:Choice Requires="w16se">
+            <w16se:symEx w16se:font="Segoe UI Emoji" w16se:char="2639"/>
+          </mc:Choice>
+          <mc:Fallback>
+            <w:t>☹</w:t>
+          </mc:Fallback>
+        </mc:AlternateContent>
+      </w:r>
+      <w:r>
+        <w:t xml:space="preserve"> </w:t>
+      </w:r>
+    </w:p>
+    <w:p>
+      <w:r>
+        <w:lastRenderedPageBreak/>
+        <w:drawing>
+          <wp:inline distT="0" distB="0" distL="0" distR="0" wp14:anchorId="1B54EA2C" wp14:editId="4D11621C">
+            <wp:extent cx="2562225" cy="4909289"/>
+            <wp:effectExtent l="0" t="0" r="0" b="5715"/>
+            <wp:docPr id="927255291" name="Picture 1"/>
+            <wp:cNvGraphicFramePr>
+              <a:graphicFrameLocks xmlns:a="http://schemas.openxmlformats.org/drawingml/2006/main" noChangeAspect="1"/>
+            </wp:cNvGraphicFramePr>
+            <a:graphic xmlns:a="http://schemas.openxmlformats.org/drawingml/2006/main">
+              <a:graphicData uri="http://schemas.openxmlformats.org/drawingml/2006/picture">
+                <pic:pic xmlns:pic="http://schemas.openxmlformats.org/drawingml/2006/picture">
+                  <pic:nvPicPr>
+                    <pic:cNvPr id="927255291" name=""/>
+                    <pic:cNvPicPr/>
+                  </pic:nvPicPr>
+                  <pic:blipFill>
+                    <a:blip r:embed="rId5"/>
+                    <a:stretch>
+                      <a:fillRect/>
+                    </a:stretch>
+                  </pic:blipFill>
+                  <pic:spPr>
+                    <a:xfrm>
+                      <a:off x="0" y="0"/>
+                      <a:ext cx="2568171" cy="4920682"/>
+                    </a:xfrm>
+                    <a:prstGeom prst="rect">
+                      <a:avLst/>
+                    </a:prstGeom>
+                  </pic:spPr>
+                </pic:pic>
+              </a:graphicData>
+            </a:graphic>
+          </wp:inline>
+        </w:drawing>
+      </w:r>
+    </w:p>
+    <w:p>
+      <w:r>
+        <w:t>2.</w:t>
+      </w:r>
+      <w:r>
+        <w:t xml:space="preserve"> Ashu -</w:t>
+      </w:r>
+      <w:r>
+        <w:t xml:space="preserve">FPGA implementation/Synthesis of the custom IP </w:t>
+      </w:r>
+      <w:r>
+        <w:t> Using the step 1 we need to fit in FPGA and see how its working with Camera (actual Camera) {ASHU} https://github.com/nktkt/riscv-soc  (a) He needs to read this github codes (b) try to git clone and run the simulation in his local laptop/PC  (c) try synthesis the design in vivado (see if its getting synthesize) (d) try boot in Virtex fpga (if synthesis working)</w:t>
+      </w:r>
+      <w:r>
+        <w:t xml:space="preserve"> </w:t>
+      </w:r>
+      <w:r>
+        <w:sym w:font="Wingdings" w:char="F0E0"/>
+      </w:r>
+      <w:r>
+        <w:t xml:space="preserve"> Won’t work with ML40X</w:t>
+      </w:r>
+    </w:p>
+    <w:p>
+      <w:r>
+        <w:t>4.</w:t>
+      </w:r>
+      <w:r>
+        <w:t xml:space="preserve"> {Sorry forgot the name}</w:t>
+      </w:r>
+      <w:r>
+        <w:tab/>
+        <w:t xml:space="preserve">DMA Controller </w:t>
+      </w:r>
+      <w:r>
+        <w:t xml:space="preserve"> Open source with testbench and checking the specs </w:t>
+      </w:r>
+      <w:r>
+        <w:t xml:space="preserve"> bandwidth/performance </w:t>
+      </w:r>
+      <w:r>
+        <w:t xml:space="preserve"> DDR4 </w:t>
+      </w:r>
+      <w:r>
+        <w:t> Compare with the AMD controller  { SPD Mtech - Student sorry i forgot the name} Mastering Xilinx DMA IP cores: AXIDMA, CDMA, VDMA on Linux Udemy link already shared (a) read it and understand and try implement in FPGA (b) understand the https://student.cs.uwaterloo.ca/~cs452/docs/ts7200/amba-spec.pdf amba specs (c) download the AXI-Stream AMBA specs from intenert read it (d) make a design using the AXI-stream (example given in vivado)</w:t>
+      </w:r>
+    </w:p>
+    <w:p>
+      <w:r>
+        <w:t>https://documentation-service.arm.com/static/64819f1516f0f201aa6b963c  {AXI stream doc}</w:t>
+      </w:r>
+    </w:p>
+    <w:p>
+      <w:r>
+        <w:lastRenderedPageBreak/>
+        <w:t xml:space="preserve">6 &amp; 7. </w:t>
+      </w:r>
+      <w:r>
+        <w:t xml:space="preserve"> Vedanshi / Aryan </w:t>
+      </w:r>
+      <w:r>
+        <w:t xml:space="preserve">: </w:t>
+      </w:r>
+      <w:r>
+        <w:t>https://github.com/eugene-tarassov/vivado-risc-v  riscv/learn: Tracking RISC-V Actions on Education, Training, Courses, Monitorships, etc. use this and start learning about the riscv rocketv/fpga etc</w:t>
+      </w:r>
+    </w:p>
+    <w:p>
+      <w:r>
+        <w:t xml:space="preserve">3. </w:t>
+      </w:r>
+      <w:r>
+        <w:t xml:space="preserve"> JATIN </w:t>
+      </w:r>
+      <w:r>
+        <w:t>Tile link cross bar {JATIN} -- TileLink/README.md at master · merledu/TileLink  https://github.com/cnrv/rocket-chip-read/blob/master/tilelink/Xbar.md  how the tile cross br generated in rocket chip (a) he needs to understand how he can generate the cross bar (b) cross should support AXIStream (c) can it be used to generate bridges</w:t>
+      </w:r>
+    </w:p>
+    <w:p>
+      <w:r>
+        <w:t>5.</w:t>
+      </w:r>
+      <w:r>
+        <w:t xml:space="preserve"> Naina :</w:t>
+      </w:r>
+      <w:r>
+        <w:t xml:space="preserve">CAMERA IP/ISP (AMD / Open source) </w:t>
+      </w:r>
+      <w:r>
+        <w:t xml:space="preserve"> MIPI protocol and raw data or chroma/luma or any other format </w:t>
+      </w:r>
+      <w:r>
+        <w:t> {NAINA} --.Kria KV260 FPGA ISP - Getting Started - Hackster.io 10x-Engineers/Infinite-ISP: A camera ISP (image signal processor) pipeline that contains modules with simple to complex algorithms implemented at the application level. (a) needs to understand the video pipeline camera --&gt; mipi --&gt; ISP --&gt; Processign element --&gt; display (b) how to use older camera QVGA with fpga (c) how to control frame rates in case of older camera</w:t>
+      </w:r>
+    </w:p>
+    <w:p>
+      <w:r>
+        <w:t>From WhatsApp:</w:t>
+      </w:r>
+    </w:p>
+    <w:p>
+      <w:r>
+        <w:t>[4:49 PM, 10/22/2026] Ajay Dash: https://www.amazon.in/Waveshare-USB-UART-I2C-JTAG/dp/B0CGLRHDRD/ref=sr_1_4?crid=3IHT61474ZUUS&amp;dib=eyJ2IjoiMSJ9.JJjF1dqEC2o02lo9djt6W_0YNK46HxGSHLM_Vk6yEtZMDGYzqaH6W8nXN309DYE4hVNPdMTXfpkgrRjFOWVgGCBQZaM--8kOsHB9M9Pol-LszjtjNwgQk7K_staOHjQtAQBipyGYflMTWnPUBn_YKPghyZTN8Z2zKDeKv3bG7-1ZJ4HFcgITdyAiUUdUHg-Uejd7teXp5Ao1EtJK4dQzVtlxIYE06LVi3Mc4Tr4frLw.m4VqW5JyM2s9r-sMJeDaExZmnm4GKOZgx6EYkfY8Z_c&amp;dib_tag=se&amp;keywords=usb+to+spi&amp;qid=1792667913&amp;sprefix=usb+to+spi%2Caps%2C263&amp;sr=8-4</w:t>
+      </w:r>
+    </w:p>
+    <w:p>
+      <w:r>
+        <w:t xml:space="preserve">[4:50 PM, 10/22/2026] Ajay Dash: </w:t>
+      </w:r>
+      <w:r>
+        <w:rPr>
+          <w:highlight w:val="cyan"/>
+        </w:rPr>
+        <w:t>this is good usb to spi i had used few years back</w:t>
+      </w:r>
+      <w:r>
+        <w:t xml:space="preserve"> --&gt; </w:t>
+      </w:r>
+      <w:hyperlink r:id="rId6" w:history="1">
+        <w:r>
+          <w:rPr>
+            <w:rStyle w:val="Hyperlink"/>
+          </w:rPr>
+          <w:t>https://www.waveshare.com/wiki/USB_TO_UART/I2C/SPI/JTAG?srsltid=AYCX9vISDxCaibSTsLxZWpPXcHd_cLXoVKKvu9-mL2c7-_7_-fqzlqCA</w:t>
+        </w:r>
+      </w:hyperlink>
+    </w:p>
+    <w:p/>
+    <w:p>
+      <w:r>
+        <w:lastRenderedPageBreak/>
+        <w:drawing>
+          <wp:inline distT="0" distB="0" distL="0" distR="0" wp14:anchorId="6FB18A7D" wp14:editId="6C139255">
+            <wp:extent cx="5943600" cy="3074035"/>
+            <wp:effectExtent l="0" t="0" r="0" b="0"/>
+            <wp:docPr id="1746111907" name="Picture 1"/>
+            <wp:cNvGraphicFramePr>
+              <a:graphicFrameLocks xmlns:a="http://schemas.openxmlformats.org/drawingml/2006/main" noChangeAspect="1"/>
+            </wp:cNvGraphicFramePr>
+            <a:graphic xmlns:a="http://schemas.openxmlformats.org/drawingml/2006/main">
+              <a:graphicData uri="http://schemas.openxmlformats.org/drawingml/2006/picture">
+                <pic:pic xmlns:pic="http://schemas.openxmlformats.org/drawingml/2006/picture">
+                  <pic:nvPicPr>
+                    <pic:cNvPr id="1746111907" name=""/>
+                    <pic:cNvPicPr/>
+                  </pic:nvPicPr>
+                  <pic:blipFill>
+                    <a:blip r:embed="rId7"/>
+                    <a:stretch>
+                      <a:fillRect/>
+                    </a:stretch>
+                  </pic:blipFill>
+                  <pic:spPr>
+                    <a:xfrm>
+                      <a:off x="0" y="0"/>
+                      <a:ext cx="5943600" cy="3074035"/>
+                    </a:xfrm>
+                    <a:prstGeom prst="rect">
+                      <a:avLst/>
+                    </a:prstGeom>
+                  </pic:spPr>
+                </pic:pic>
+              </a:graphicData>
+            </a:graphic>
+          </wp:inline>
+        </w:drawing>
+      </w:r>
+    </w:p>
+    <w:p>
+      <w:r>
+        <w:lastRenderedPageBreak/>
+        <w:drawing>
+          <wp:inline distT="0" distB="0" distL="0" distR="0" wp14:anchorId="11AB2523" wp14:editId="4521295D">
+            <wp:extent cx="5943600" cy="5372735"/>
+            <wp:effectExtent l="0" t="0" r="0" b="0"/>
+            <wp:docPr id="1777175776" name="Picture 1"/>
+            <wp:cNvGraphicFramePr>
+              <a:graphicFrameLocks xmlns:a="http://schemas.openxmlformats.org/drawingml/2006/main" noChangeAspect="1"/>
+            </wp:cNvGraphicFramePr>
+            <a:graphic xmlns:a="http://schemas.openxmlformats.org/drawingml/2006/main">
+              <a:graphicData uri="http://schemas.openxmlformats.org/drawingml/2006/picture">
+                <pic:pic xmlns:pic="http://schemas.openxmlformats.org/drawingml/2006/picture">
+                  <pic:nvPicPr>
+                    <pic:cNvPr id="1777175776" name=""/>
+                    <pic:cNvPicPr/>
+                  </pic:nvPicPr>
+                  <pic:blipFill>
+                    <a:blip r:embed="rId8"/>
+                    <a:stretch>
+                      <a:fillRect/>
+                    </a:stretch>
+                  </pic:blipFill>
+                  <pic:spPr>
+                    <a:xfrm>
+                      <a:off x="0" y="0"/>
+                      <a:ext cx="5943600" cy="5372735"/>
+                    </a:xfrm>
+                    <a:prstGeom prst="rect">
+                      <a:avLst/>
+                    </a:prstGeom>
+                  </pic:spPr>
+                </pic:pic>
+              </a:graphicData>
+            </a:graphic>
+          </wp:inline>
+        </w:drawing>
       </w:r>
     </w:p>
     <w:sectPr>
@@ -1365,6 +1659,29 @@
       <w:spacing w:val="5"/>
     </w:rPr>
   </w:style>
+  <w:style w:type="character" w:styleId="Hyperlink">
+    <w:name w:val="Hyperlink"/>
+    <w:basedOn w:val="DefaultParagraphFont"/>
+    <w:uiPriority w:val="99"/>
+    <w:unhideWhenUsed/>
+    <w:rsid w:val="00716797"/>
+    <w:rPr>
+      <w:color w:val="0563C1" w:themeColor="hyperlink"/>
+      <w:u w:val="single"/>
+    </w:rPr>
+  </w:style>
+  <w:style w:type="character" w:styleId="UnresolvedMention">
+    <w:name w:val="Unresolved Mention"/>
+    <w:basedOn w:val="DefaultParagraphFont"/>
+    <w:uiPriority w:val="99"/>
+    <w:semiHidden/>
+    <w:unhideWhenUsed/>
+    <w:rsid w:val="00716797"/>
+    <w:rPr>
+      <w:color w:val="605E5C"/>
+      <w:shd w:val="clear" w:color="auto" w:fill="E1DFDD"/>
+    </w:rPr>
+  </w:style>
 </w:styles>
 </file>
 

</xml_diff>